<commit_message>
feat: actualizar a v1.6.19 - mejoras en UI, manejo de errores y estados de carga
</commit_message>
<xml_diff>
--- a/Instructivo Creacion de cuenta y cambio de plan de Spark a Blaze.docx
+++ b/Instructivo Creacion de cuenta y cambio de plan de Spark a Blaze.docx
@@ -244,7 +244,15 @@
         </mc:AlternateContent>
       </w:r>
       <w:r>
-        <w:t xml:space="preserve">si esta logueado en alguna cuenta de Google saldrá esto </w:t>
+        <w:t xml:space="preserve">si esta </w:t>
+      </w:r>
+      <w:proofErr w:type="spellStart"/>
+      <w:r>
+        <w:t>logueado</w:t>
+      </w:r>
+      <w:proofErr w:type="spellEnd"/>
+      <w:r>
+        <w:t xml:space="preserve"> en alguna cuenta de Google saldrá esto </w:t>
       </w:r>
     </w:p>
     <w:p>
@@ -742,7 +750,15 @@
     </w:p>
     <w:p>
       <w:r>
-        <w:t>En Google escriba Firebase Console</w:t>
+        <w:t xml:space="preserve">En Google escriba </w:t>
+      </w:r>
+      <w:proofErr w:type="spellStart"/>
+      <w:r>
+        <w:t>Firebase</w:t>
+      </w:r>
+      <w:proofErr w:type="spellEnd"/>
+      <w:r>
+        <w:t xml:space="preserve"> Console</w:t>
       </w:r>
     </w:p>
     <w:p>
@@ -1219,6 +1235,9 @@
         </mc:AlternateContent>
       </w:r>
       <w:r>
+        <w:rPr>
+          <w:noProof/>
+        </w:rPr>
         <w:drawing>
           <wp:inline distT="0" distB="0" distL="0" distR="0" wp14:anchorId="2C2A360C" wp14:editId="185822A1">
             <wp:extent cx="5612130" cy="2729865"/>
@@ -1258,6 +1277,9 @@
     </w:p>
     <w:p>
       <w:r>
+        <w:rPr>
+          <w:noProof/>
+        </w:rPr>
         <w:drawing>
           <wp:inline distT="0" distB="0" distL="0" distR="0" wp14:anchorId="58B632CC" wp14:editId="5877F100">
             <wp:extent cx="5612130" cy="3357880"/>
@@ -1467,6 +1489,9 @@
         </mc:AlternateContent>
       </w:r>
       <w:r>
+        <w:rPr>
+          <w:noProof/>
+        </w:rPr>
         <w:drawing>
           <wp:inline distT="0" distB="0" distL="0" distR="0" wp14:anchorId="5523134C" wp14:editId="355AA8B8">
             <wp:extent cx="5612130" cy="3495040"/>
@@ -1758,6 +1783,9 @@
         </mc:AlternateContent>
       </w:r>
       <w:r>
+        <w:rPr>
+          <w:noProof/>
+        </w:rPr>
         <w:drawing>
           <wp:inline distT="0" distB="0" distL="0" distR="0" wp14:anchorId="0B4734E7" wp14:editId="68D7EB9B">
             <wp:extent cx="5612130" cy="3566160"/>
@@ -1805,7 +1833,23 @@
     <w:p/>
     <w:p>
       <w:r>
-        <w:t>Actualizar plan de Firebase deSpark a Blaze</w:t>
+        <w:t xml:space="preserve">Actualizar plan de </w:t>
+      </w:r>
+      <w:proofErr w:type="spellStart"/>
+      <w:r>
+        <w:t>Firebase</w:t>
+      </w:r>
+      <w:proofErr w:type="spellEnd"/>
+      <w:r>
+        <w:t xml:space="preserve"> </w:t>
+      </w:r>
+      <w:proofErr w:type="spellStart"/>
+      <w:r>
+        <w:t>deSpark</w:t>
+      </w:r>
+      <w:proofErr w:type="spellEnd"/>
+      <w:r>
+        <w:t xml:space="preserve"> a Blaze</w:t>
       </w:r>
     </w:p>
     <w:p>

</xml_diff>